<commit_message>
fix: upgrade recalcula Dias Perdidos historicos (codeunit 60018)
Corrigir o CalcDays na 1.2.0.3 nao bastou: os registros ja gravados continuaram
errados, porque CalcDays so roda em OnInsert/OnModify e nao existe recalculo
retroativo. A tela do Rogerio comprova — paradas de 7 minutos ainda com 5 dias.

Novo codeunit 60018 'KINTO Downtime Days Recalc' (Subtype = Upgrade) roda em
OnUpgradePerCompany e acerta o historico uma unica vez. Idempotente: so toca nas
linhas cujo valor gravado difere do calculo correto (86.400.000), entao reexecutar
nao muda nada. Permissao incluida no KINTO Contract Admin.

Tentativa anterior falhou com AL0477 — OnUpgradePerCompany exige Subtype=Upgrade,
e o codeunit de install nao pode ter o trigger. Seguido o padrao ja existente do
projeto (KINTO Series Setup Upgrade).

manual v7: 35 imagens, todas as 16 telas D1-D5 · legendas conferidas contra as
imagens (2 corrigidas: avaliacao-card e prefechamento-card tinham numeros de
outra linha da lista)
</commit_message>
<xml_diff>
--- a/docs/kiadynbc-manual-usuario-v7.docx
+++ b/docs/kiadynbc-manual-usuario-v7.docx
@@ -2500,6 +2500,66 @@
     </w:p>
     <w:p>
       <w:pPr>
+        <w:jc w:val="center"/>
+      </w:pPr>
+      <w:r>
+        <w:drawing>
+          <wp:inline xmlns:a="http://schemas.openxmlformats.org/drawingml/2006/main" xmlns:pic="http://schemas.openxmlformats.org/drawingml/2006/picture">
+            <wp:extent cx="5760720" cy="2511264"/>
+            <wp:docPr id="25" name="Picture 25"/>
+            <wp:cNvGraphicFramePr>
+              <a:graphicFrameLocks noChangeAspect="1"/>
+            </wp:cNvGraphicFramePr>
+            <a:graphic>
+              <a:graphicData uri="http://schemas.openxmlformats.org/drawingml/2006/picture">
+                <pic:pic>
+                  <pic:nvPicPr>
+                    <pic:cNvPr id="0" name="25-sla-violacoes.png"/>
+                    <pic:cNvPicPr/>
+                  </pic:nvPicPr>
+                  <pic:blipFill>
+                    <a:blip r:embed="rId33"/>
+                    <a:stretch>
+                      <a:fillRect/>
+                    </a:stretch>
+                  </pic:blipFill>
+                  <pic:spPr>
+                    <a:xfrm>
+                      <a:off x="0" y="0"/>
+                      <a:ext cx="5760720" cy="2511264"/>
+                    </a:xfrm>
+                    <a:prstGeom prst="rect"/>
+                  </pic:spPr>
+                </pic:pic>
+              </a:graphicData>
+            </a:graphic>
+          </wp:inline>
+        </w:drawing>
+      </w:r>
+    </w:p>
+    <w:p>
+      <w:pPr>
+        <w:jc w:val="center"/>
+      </w:pPr>
+      <w:r>
+        <w:rPr>
+          <w:i/>
+          <w:sz w:val="18"/>
+        </w:rPr>
+        <w:t>KINTO Violações de SLA — cada linha é um prazo estourado, com horas decorridas, meta, valor da penalidade e se o crédito foi criado. Nas linhas do contrato C-00659 a penalidade sai 0,00: o teto do mês já havia sido consumido pelas violações anteriores.</w:t>
+      </w:r>
+    </w:p>
+    <w:p>
+      <w:r>
+        <w:rPr>
+          <w:b w:val="0"/>
+          <w:i w:val="0"/>
+        </w:rPr>
+        <w:t>Use a ação Check SLA Violations na lista para rodar a apuração na hora, sem esperar o Job Queue. É a mesma varredura que o job executa.</w:t>
+      </w:r>
+    </w:p>
+    <w:p>
+      <w:pPr>
         <w:pStyle w:val="Heading1"/>
       </w:pPr>
       <w:r>
@@ -2547,8 +2607,8 @@
       <w:r>
         <w:drawing>
           <wp:inline xmlns:a="http://schemas.openxmlformats.org/drawingml/2006/main" xmlns:pic="http://schemas.openxmlformats.org/drawingml/2006/picture">
-            <wp:extent cx="5760720" cy="2625634"/>
-            <wp:docPr id="25" name="Picture 25"/>
+            <wp:extent cx="5760720" cy="2572065"/>
+            <wp:docPr id="26" name="Picture 26"/>
             <wp:cNvGraphicFramePr>
               <a:graphicFrameLocks noChangeAspect="1"/>
             </wp:cNvGraphicFramePr>
@@ -2560,7 +2620,7 @@
                     <pic:cNvPicPr/>
                   </pic:nvPicPr>
                   <pic:blipFill>
-                    <a:blip r:embed="rId33"/>
+                    <a:blip r:embed="rId34"/>
                     <a:stretch>
                       <a:fillRect/>
                     </a:stretch>
@@ -2568,7 +2628,7 @@
                   <pic:spPr>
                     <a:xfrm>
                       <a:off x="0" y="0"/>
-                      <a:ext cx="5760720" cy="2625634"/>
+                      <a:ext cx="5760720" cy="2572065"/>
                     </a:xfrm>
                     <a:prstGeom prst="rect"/>
                   </pic:spPr>
@@ -2588,7 +2648,7 @@
           <w:i/>
           <w:sz w:val="18"/>
         </w:rPr>
-        <w:t>KINTO Indisponibilidade do Veículo — paradas por veículo/contrato com início, fim, motivo, dias perdidos e a marca de crédito já criado</w:t>
+        <w:t>KINTO Indisponibilidade do Veículo — paradas por veículo/contrato com início, fim, motivo, dias perdidos, ticket de origem e a marca de crédito já criado. Esta captura é de uma base anterior à 1.2.0.5: nela os Dias Perdidos ainda aparecem inflados (7 minutos marcados como 5 dias). A 1.2.0.5 recalcula o histórico no upgrade e o valor passa a refletir a duração real.</w:t>
       </w:r>
     </w:p>
     <w:p>
@@ -2697,7 +2757,7 @@
         <w:drawing>
           <wp:inline xmlns:a="http://schemas.openxmlformats.org/drawingml/2006/main" xmlns:pic="http://schemas.openxmlformats.org/drawingml/2006/picture">
             <wp:extent cx="5760720" cy="1349358"/>
-            <wp:docPr id="26" name="Picture 26"/>
+            <wp:docPr id="27" name="Picture 27"/>
             <wp:cNvGraphicFramePr>
               <a:graphicFrameLocks noChangeAspect="1"/>
             </wp:cNvGraphicFramePr>
@@ -2709,7 +2769,7 @@
                     <pic:cNvPicPr/>
                   </pic:nvPicPr>
                   <pic:blipFill>
-                    <a:blip r:embed="rId34"/>
+                    <a:blip r:embed="rId35"/>
                     <a:stretch>
                       <a:fillRect/>
                     </a:stretch>
@@ -2748,7 +2808,7 @@
         <w:drawing>
           <wp:inline xmlns:a="http://schemas.openxmlformats.org/drawingml/2006/main" xmlns:pic="http://schemas.openxmlformats.org/drawingml/2006/picture">
             <wp:extent cx="5760720" cy="2492988"/>
-            <wp:docPr id="27" name="Picture 27"/>
+            <wp:docPr id="28" name="Picture 28"/>
             <wp:cNvGraphicFramePr>
               <a:graphicFrameLocks noChangeAspect="1"/>
             </wp:cNvGraphicFramePr>
@@ -2760,7 +2820,7 @@
                     <pic:cNvPicPr/>
                   </pic:nvPicPr>
                   <pic:blipFill>
-                    <a:blip r:embed="rId35"/>
+                    <a:blip r:embed="rId36"/>
                     <a:stretch>
                       <a:fillRect/>
                     </a:stretch>
@@ -2903,7 +2963,7 @@
         <w:drawing>
           <wp:inline xmlns:a="http://schemas.openxmlformats.org/drawingml/2006/main" xmlns:pic="http://schemas.openxmlformats.org/drawingml/2006/picture">
             <wp:extent cx="5760720" cy="2596231"/>
-            <wp:docPr id="28" name="Picture 28"/>
+            <wp:docPr id="29" name="Picture 29"/>
             <wp:cNvGraphicFramePr>
               <a:graphicFrameLocks noChangeAspect="1"/>
             </wp:cNvGraphicFramePr>
@@ -2915,7 +2975,7 @@
                     <pic:cNvPicPr/>
                   </pic:nvPicPr>
                   <pic:blipFill>
-                    <a:blip r:embed="rId36"/>
+                    <a:blip r:embed="rId37"/>
                     <a:stretch>
                       <a:fillRect/>
                     </a:stretch>
@@ -2954,7 +3014,7 @@
         <w:drawing>
           <wp:inline xmlns:a="http://schemas.openxmlformats.org/drawingml/2006/main" xmlns:pic="http://schemas.openxmlformats.org/drawingml/2006/picture">
             <wp:extent cx="5760720" cy="2827020"/>
-            <wp:docPr id="29" name="Picture 29"/>
+            <wp:docPr id="30" name="Picture 30"/>
             <wp:cNvGraphicFramePr>
               <a:graphicFrameLocks noChangeAspect="1"/>
             </wp:cNvGraphicFramePr>
@@ -2966,7 +3026,7 @@
                     <pic:cNvPicPr/>
                   </pic:nvPicPr>
                   <pic:blipFill>
-                    <a:blip r:embed="rId37"/>
+                    <a:blip r:embed="rId38"/>
                     <a:stretch>
                       <a:fillRect/>
                     </a:stretch>
@@ -2994,7 +3054,7 @@
           <w:i/>
           <w:sz w:val="18"/>
         </w:rPr>
-        <w:t>Avaliação EV-337 do contrato C-00565: notas por dimensão, pontuação geral 3, risco Médio e recomendação de renovação</w:t>
+        <w:t>Cartão da avaliação do contrato C-00565, ainda em Rascunho: as notas por dimensão são preenchidas aqui e a pontuação geral, a classificação de risco e a recomendação de renovação são calculadas pelo sistema</w:t>
       </w:r>
     </w:p>
     <w:p>
@@ -3079,7 +3139,7 @@
         <w:drawing>
           <wp:inline xmlns:a="http://schemas.openxmlformats.org/drawingml/2006/main" xmlns:pic="http://schemas.openxmlformats.org/drawingml/2006/picture">
             <wp:extent cx="5760720" cy="2654941"/>
-            <wp:docPr id="30" name="Picture 30"/>
+            <wp:docPr id="31" name="Picture 31"/>
             <wp:cNvGraphicFramePr>
               <a:graphicFrameLocks noChangeAspect="1"/>
             </wp:cNvGraphicFramePr>
@@ -3091,7 +3151,7 @@
                     <pic:cNvPicPr/>
                   </pic:nvPicPr>
                   <pic:blipFill>
-                    <a:blip r:embed="rId38"/>
+                    <a:blip r:embed="rId39"/>
                     <a:stretch>
                       <a:fillRect/>
                     </a:stretch>
@@ -3130,7 +3190,7 @@
         <w:drawing>
           <wp:inline xmlns:a="http://schemas.openxmlformats.org/drawingml/2006/main" xmlns:pic="http://schemas.openxmlformats.org/drawingml/2006/picture">
             <wp:extent cx="5760720" cy="2828548"/>
-            <wp:docPr id="31" name="Picture 31"/>
+            <wp:docPr id="32" name="Picture 32"/>
             <wp:cNvGraphicFramePr>
               <a:graphicFrameLocks noChangeAspect="1"/>
             </wp:cNvGraphicFramePr>
@@ -3142,7 +3202,7 @@
                     <pic:cNvPicPr/>
                   </pic:nvPicPr>
                   <pic:blipFill>
-                    <a:blip r:embed="rId39"/>
+                    <a:blip r:embed="rId40"/>
                     <a:stretch>
                       <a:fillRect/>
                     </a:stretch>
@@ -3170,7 +3230,7 @@
           <w:i/>
           <w:sz w:val="18"/>
         </w:rPr>
-        <w:t>Pré-fechamento do contrato C-00567: odômetro previsto 39.500 km, excesso previsto de 3.500 km e checklist de encerramento</w:t>
+        <w:t>Cartão do pré-fechamento do contrato C-00567, em Rascunho: data prevista de devolução 01/11/2027 e data de envio do aviso ao cliente</w:t>
       </w:r>
     </w:p>
     <w:p>
@@ -3244,7 +3304,7 @@
         <w:drawing>
           <wp:inline xmlns:a="http://schemas.openxmlformats.org/drawingml/2006/main" xmlns:pic="http://schemas.openxmlformats.org/drawingml/2006/picture">
             <wp:extent cx="5760720" cy="2585212"/>
-            <wp:docPr id="32" name="Picture 32"/>
+            <wp:docPr id="33" name="Picture 33"/>
             <wp:cNvGraphicFramePr>
               <a:graphicFrameLocks noChangeAspect="1"/>
             </wp:cNvGraphicFramePr>
@@ -3256,7 +3316,7 @@
                     <pic:cNvPicPr/>
                   </pic:nvPicPr>
                   <pic:blipFill>
-                    <a:blip r:embed="rId40"/>
+                    <a:blip r:embed="rId41"/>
                     <a:stretch>
                       <a:fillRect/>
                     </a:stretch>
@@ -3316,7 +3376,7 @@
         <w:drawing>
           <wp:inline xmlns:a="http://schemas.openxmlformats.org/drawingml/2006/main" xmlns:pic="http://schemas.openxmlformats.org/drawingml/2006/picture">
             <wp:extent cx="5760720" cy="2636322"/>
-            <wp:docPr id="33" name="Picture 33"/>
+            <wp:docPr id="34" name="Picture 34"/>
             <wp:cNvGraphicFramePr>
               <a:graphicFrameLocks noChangeAspect="1"/>
             </wp:cNvGraphicFramePr>
@@ -3328,7 +3388,7 @@
                     <pic:cNvPicPr/>
                   </pic:nvPicPr>
                   <pic:blipFill>
-                    <a:blip r:embed="rId41"/>
+                    <a:blip r:embed="rId42"/>
                     <a:stretch>
                       <a:fillRect/>
                     </a:stretch>
@@ -3411,6 +3471,57 @@
           <w:color w:val="B45000"/>
         </w:rPr>
         <w:t>⚠ Contrato encerrado não pode ser prorrogado: o sistema rejeita a extensão e pede a renovação como contrato novo.</w:t>
+      </w:r>
+    </w:p>
+    <w:p>
+      <w:pPr>
+        <w:jc w:val="center"/>
+      </w:pPr>
+      <w:r>
+        <w:drawing>
+          <wp:inline xmlns:a="http://schemas.openxmlformats.org/drawingml/2006/main" xmlns:pic="http://schemas.openxmlformats.org/drawingml/2006/picture">
+            <wp:extent cx="5760720" cy="2555987"/>
+            <wp:docPr id="35" name="Picture 35"/>
+            <wp:cNvGraphicFramePr>
+              <a:graphicFrameLocks noChangeAspect="1"/>
+            </wp:cNvGraphicFramePr>
+            <a:graphic>
+              <a:graphicData uri="http://schemas.openxmlformats.org/drawingml/2006/picture">
+                <pic:pic>
+                  <pic:nvPicPr>
+                    <pic:cNvPr id="0" name="36-log-expiracao.png"/>
+                    <pic:cNvPicPr/>
+                  </pic:nvPicPr>
+                  <pic:blipFill>
+                    <a:blip r:embed="rId43"/>
+                    <a:stretch>
+                      <a:fillRect/>
+                    </a:stretch>
+                  </pic:blipFill>
+                  <pic:spPr>
+                    <a:xfrm>
+                      <a:off x="0" y="0"/>
+                      <a:ext cx="5760720" cy="2555987"/>
+                    </a:xfrm>
+                    <a:prstGeom prst="rect"/>
+                  </pic:spPr>
+                </pic:pic>
+              </a:graphicData>
+            </a:graphic>
+          </wp:inline>
+        </w:drawing>
+      </w:r>
+    </w:p>
+    <w:p>
+      <w:pPr>
+        <w:jc w:val="center"/>
+      </w:pPr>
+      <w:r>
+        <w:rPr>
+          <w:i/>
+          <w:sz w:val="18"/>
+        </w:rPr>
+        <w:t>KINTO Log de Expiração de Contrato — ações registradas pelo ciclo de vida por contrato: aviso enviado (30 dias antes), avaliação devida (15 dias) e a mensagem do que foi feito</w:t>
       </w:r>
     </w:p>
     <w:p>

</xml_diff>